<commit_message>
Complement the retrospective from the second cycle
</commit_message>
<xml_diff>
--- a/Retrospectiva.docx
+++ b/Retrospectiva.docx
@@ -62,55 +62,27 @@
         <w:rPr>
           <w:rFonts w:ascii="Arial" w:hAnsi="Arial" w:cs="Arial"/>
         </w:rPr>
-        <w:t xml:space="preserve">¿Cuáles fueron los </w:t>
-      </w:r>
-      <w:proofErr w:type="spellStart"/>
-      <w:r>
-        <w:rPr>
-          <w:rFonts w:ascii="Arial" w:hAnsi="Arial" w:cs="Arial"/>
-        </w:rPr>
-        <w:t>mini-ciclos</w:t>
-      </w:r>
-      <w:proofErr w:type="spellEnd"/>
-      <w:r>
-        <w:rPr>
-          <w:rFonts w:ascii="Arial" w:hAnsi="Arial" w:cs="Arial"/>
-        </w:rPr>
-        <w:t xml:space="preserve"> definidos? Justifíquenlos.</w:t>
-      </w:r>
-    </w:p>
-    <w:p>
-      <w:pPr>
-        <w:rPr>
-          <w:rFonts w:ascii="Arial" w:hAnsi="Arial" w:cs="Arial"/>
-        </w:rPr>
-      </w:pPr>
-    </w:p>
-    <w:p>
-      <w:pPr>
-        <w:rPr>
-          <w:rFonts w:ascii="Arial" w:hAnsi="Arial" w:cs="Arial"/>
-        </w:rPr>
-      </w:pPr>
-      <w:r>
-        <w:rPr>
-          <w:rFonts w:ascii="Arial" w:hAnsi="Arial" w:cs="Arial"/>
-        </w:rPr>
-        <w:t xml:space="preserve">Establecimos 5 </w:t>
-      </w:r>
-      <w:proofErr w:type="spellStart"/>
-      <w:r>
-        <w:rPr>
-          <w:rFonts w:ascii="Arial" w:hAnsi="Arial" w:cs="Arial"/>
-        </w:rPr>
-        <w:t>mini-ciclos</w:t>
-      </w:r>
-      <w:proofErr w:type="spellEnd"/>
-      <w:r>
-        <w:rPr>
-          <w:rFonts w:ascii="Arial" w:hAnsi="Arial" w:cs="Arial"/>
-        </w:rPr>
-        <w:t>:</w:t>
+        <w:t>¿Cuáles fueron los mini-ciclos definidos? Justifíquenlos.</w:t>
+      </w:r>
+    </w:p>
+    <w:p>
+      <w:pPr>
+        <w:rPr>
+          <w:rFonts w:ascii="Arial" w:hAnsi="Arial" w:cs="Arial"/>
+        </w:rPr>
+      </w:pPr>
+    </w:p>
+    <w:p>
+      <w:pPr>
+        <w:rPr>
+          <w:rFonts w:ascii="Arial" w:hAnsi="Arial" w:cs="Arial"/>
+        </w:rPr>
+      </w:pPr>
+      <w:r>
+        <w:rPr>
+          <w:rFonts w:ascii="Arial" w:hAnsi="Arial" w:cs="Arial"/>
+        </w:rPr>
+        <w:t>Establecimos 5 mini-ciclos:</w:t>
       </w:r>
     </w:p>
     <w:p>
@@ -146,21 +118,7 @@
         <w:rPr>
           <w:rFonts w:ascii="Arial" w:hAnsi="Arial" w:cs="Arial"/>
         </w:rPr>
-        <w:t>Adición y eliminación de ruedas y símbolos: definir estas dos clases con sus constructores y métodos necesarios para poder adicionar estos objetos a las estructuras de datos (</w:t>
-      </w:r>
-      <w:proofErr w:type="spellStart"/>
-      <w:r>
-        <w:rPr>
-          <w:rFonts w:ascii="Arial" w:hAnsi="Arial" w:cs="Arial"/>
-        </w:rPr>
-        <w:t>TreeMap</w:t>
-      </w:r>
-      <w:proofErr w:type="spellEnd"/>
-      <w:r>
-        <w:rPr>
-          <w:rFonts w:ascii="Arial" w:hAnsi="Arial" w:cs="Arial"/>
-        </w:rPr>
-        <w:t>) respectivas.</w:t>
+        <w:t>Adición y eliminación de ruedas y símbolos: definir estas dos clases con sus constructores y métodos necesarios para poder adicionar estos objetos a las estructuras de datos (TreeMap) respectivas.</w:t>
       </w:r>
     </w:p>
     <w:p>
@@ -184,21 +142,7 @@
         <w:rPr>
           <w:rFonts w:ascii="Arial" w:hAnsi="Arial" w:cs="Arial"/>
         </w:rPr>
-        <w:t xml:space="preserve"> para girar una rueda, cambiar el símbolo de una rueda en </w:t>
-      </w:r>
-      <w:proofErr w:type="spellStart"/>
-      <w:r>
-        <w:rPr>
-          <w:rFonts w:ascii="Arial" w:hAnsi="Arial" w:cs="Arial"/>
-        </w:rPr>
-        <w:t>especifico</w:t>
-      </w:r>
-      <w:proofErr w:type="spellEnd"/>
-      <w:r>
-        <w:rPr>
-          <w:rFonts w:ascii="Arial" w:hAnsi="Arial" w:cs="Arial"/>
-        </w:rPr>
-        <w:t xml:space="preserve"> y para girar todas las ruedas al mismo tiempo.</w:t>
+        <w:t xml:space="preserve"> para girar una rueda, cambiar el símbolo de una rueda en especifico y para girar todas las ruedas al mismo tiempo.</w:t>
       </w:r>
     </w:p>
     <w:p>
@@ -216,35 +160,7 @@
         <w:rPr>
           <w:rFonts w:ascii="Arial" w:hAnsi="Arial" w:cs="Arial"/>
         </w:rPr>
-        <w:t xml:space="preserve">Consulta de datos de la máquina: creación de los métodos para saber los posibles símbolos que hay, para saber la cantidad de símbolos distintos entre las ruedas, para saber los símbolos que hay en cada rueda de manera ordenada y para saber si se </w:t>
-      </w:r>
-      <w:proofErr w:type="spellStart"/>
-      <w:r>
-        <w:rPr>
-          <w:rFonts w:ascii="Arial" w:hAnsi="Arial" w:cs="Arial"/>
-        </w:rPr>
-        <w:t>logro</w:t>
-      </w:r>
-      <w:proofErr w:type="spellEnd"/>
-      <w:r>
-        <w:rPr>
-          <w:rFonts w:ascii="Arial" w:hAnsi="Arial" w:cs="Arial"/>
-        </w:rPr>
-        <w:t xml:space="preserve"> el </w:t>
-      </w:r>
-      <w:proofErr w:type="spellStart"/>
-      <w:r>
-        <w:rPr>
-          <w:rFonts w:ascii="Arial" w:hAnsi="Arial" w:cs="Arial"/>
-        </w:rPr>
-        <w:t>jackpot</w:t>
-      </w:r>
-      <w:proofErr w:type="spellEnd"/>
-      <w:r>
-        <w:rPr>
-          <w:rFonts w:ascii="Arial" w:hAnsi="Arial" w:cs="Arial"/>
-        </w:rPr>
-        <w:t xml:space="preserve"> (es decir que todos los símbolos sean iguales, que significa que solo hay 1 símbolo distinto)</w:t>
+        <w:t>Consulta de datos de la máquina: creación de los métodos para saber los posibles símbolos que hay, para saber la cantidad de símbolos distintos entre las ruedas, para saber los símbolos que hay en cada rueda de manera ordenada y para saber si se logro el jackpot (es decir que todos los símbolos sean iguales, que significa que solo hay 1 símbolo distinto)</w:t>
       </w:r>
     </w:p>
     <w:p>
@@ -275,35 +191,7 @@
         <w:rPr>
           <w:rFonts w:ascii="Arial" w:hAnsi="Arial" w:cs="Arial"/>
         </w:rPr>
-        <w:t xml:space="preserve">Establecimos estos </w:t>
-      </w:r>
-      <w:proofErr w:type="spellStart"/>
-      <w:r>
-        <w:rPr>
-          <w:rFonts w:ascii="Arial" w:hAnsi="Arial" w:cs="Arial"/>
-        </w:rPr>
-        <w:t>mini-ciclos</w:t>
-      </w:r>
-      <w:proofErr w:type="spellEnd"/>
-      <w:r>
-        <w:rPr>
-          <w:rFonts w:ascii="Arial" w:hAnsi="Arial" w:cs="Arial"/>
-        </w:rPr>
-        <w:t xml:space="preserve"> debido a que nos permite repartir de forma equilibrada los métodos propuestos para la clase </w:t>
-      </w:r>
-      <w:proofErr w:type="spellStart"/>
-      <w:r>
-        <w:rPr>
-          <w:rFonts w:ascii="Arial" w:hAnsi="Arial" w:cs="Arial"/>
-        </w:rPr>
-        <w:t>SlotMachine</w:t>
-      </w:r>
-      <w:proofErr w:type="spellEnd"/>
-      <w:r>
-        <w:rPr>
-          <w:rFonts w:ascii="Arial" w:hAnsi="Arial" w:cs="Arial"/>
-        </w:rPr>
-        <w:t xml:space="preserve"> además que están separados según las funciones que </w:t>
+        <w:t xml:space="preserve">Establecimos estos mini-ciclos debido a que nos permite repartir de forma equilibrada los métodos propuestos para la clase SlotMachine además que están separados según las funciones que </w:t>
       </w:r>
       <w:r>
         <w:rPr>
@@ -490,62 +378,20 @@
         <w:rPr>
           <w:rFonts w:ascii="Arial" w:hAnsi="Arial" w:cs="Arial"/>
         </w:rPr>
-        <w:t xml:space="preserve">¿Cuál es el estado actual del proyecto en términos de </w:t>
-      </w:r>
-      <w:proofErr w:type="spellStart"/>
-      <w:r>
-        <w:rPr>
-          <w:rFonts w:ascii="Arial" w:hAnsi="Arial" w:cs="Arial"/>
-        </w:rPr>
-        <w:t>mini-ciclos</w:t>
-      </w:r>
-      <w:proofErr w:type="spellEnd"/>
-      <w:r>
-        <w:rPr>
-          <w:rFonts w:ascii="Arial" w:hAnsi="Arial" w:cs="Arial"/>
-        </w:rPr>
-        <w:t>? ¿por qué?</w:t>
-      </w:r>
-    </w:p>
-    <w:p>
-      <w:pPr>
-        <w:rPr>
-          <w:rFonts w:ascii="Arial" w:hAnsi="Arial" w:cs="Arial"/>
-        </w:rPr>
-      </w:pPr>
-      <w:r>
-        <w:rPr>
-          <w:rFonts w:ascii="Arial" w:hAnsi="Arial" w:cs="Arial"/>
-        </w:rPr>
-        <w:t xml:space="preserve">El estado actual, en términos de </w:t>
-      </w:r>
-      <w:proofErr w:type="spellStart"/>
-      <w:r>
-        <w:rPr>
-          <w:rFonts w:ascii="Arial" w:hAnsi="Arial" w:cs="Arial"/>
-        </w:rPr>
-        <w:t>mini-ciclos</w:t>
-      </w:r>
-      <w:proofErr w:type="spellEnd"/>
-      <w:r>
-        <w:rPr>
-          <w:rFonts w:ascii="Arial" w:hAnsi="Arial" w:cs="Arial"/>
-        </w:rPr>
-        <w:t xml:space="preserve">, se encuentra totalmente terminado, cumpliendo la organización propuesta en los </w:t>
-      </w:r>
-      <w:proofErr w:type="spellStart"/>
-      <w:r>
-        <w:rPr>
-          <w:rFonts w:ascii="Arial" w:hAnsi="Arial" w:cs="Arial"/>
-        </w:rPr>
-        <w:t>mini-ciclos</w:t>
-      </w:r>
-      <w:proofErr w:type="spellEnd"/>
-      <w:r>
-        <w:rPr>
-          <w:rFonts w:ascii="Arial" w:hAnsi="Arial" w:cs="Arial"/>
-        </w:rPr>
-        <w:t>.</w:t>
+        <w:t>¿Cuál es el estado actual del proyecto en términos de mini-ciclos? ¿por qué?</w:t>
+      </w:r>
+    </w:p>
+    <w:p>
+      <w:pPr>
+        <w:rPr>
+          <w:rFonts w:ascii="Arial" w:hAnsi="Arial" w:cs="Arial"/>
+        </w:rPr>
+      </w:pPr>
+      <w:r>
+        <w:rPr>
+          <w:rFonts w:ascii="Arial" w:hAnsi="Arial" w:cs="Arial"/>
+        </w:rPr>
+        <w:t>El estado actual, en términos de mini-ciclos, se encuentra totalmente terminado, cumpliendo la organización propuesta en los mini-ciclos.</w:t>
       </w:r>
     </w:p>
     <w:p>
@@ -590,21 +436,7 @@
         <w:rPr>
           <w:rFonts w:ascii="Arial" w:hAnsi="Arial" w:cs="Arial"/>
         </w:rPr>
-        <w:t xml:space="preserve">En total se </w:t>
-      </w:r>
-      <w:proofErr w:type="spellStart"/>
-      <w:r>
-        <w:rPr>
-          <w:rFonts w:ascii="Arial" w:hAnsi="Arial" w:cs="Arial"/>
-        </w:rPr>
-        <w:t>realizo</w:t>
-      </w:r>
-      <w:proofErr w:type="spellEnd"/>
-      <w:r>
-        <w:rPr>
-          <w:rFonts w:ascii="Arial" w:hAnsi="Arial" w:cs="Arial"/>
-        </w:rPr>
-        <w:t xml:space="preserve"> una inversión de 11 horas y 30 minutos por persona.</w:t>
+        <w:t>En total se realizo una inversión de 11 horas y 30 minutos por persona.</w:t>
       </w:r>
     </w:p>
     <w:p>
@@ -642,21 +474,7 @@
         <w:rPr>
           <w:rFonts w:ascii="Arial" w:hAnsi="Arial" w:cs="Arial"/>
         </w:rPr>
-        <w:t xml:space="preserve">El mayor logro en general es todo el aprendizaje que estamos adquiriendo mediante estos proyectos, para así tener </w:t>
-      </w:r>
-      <w:proofErr w:type="spellStart"/>
-      <w:r>
-        <w:rPr>
-          <w:rFonts w:ascii="Arial" w:hAnsi="Arial" w:cs="Arial"/>
-        </w:rPr>
-        <w:t>mas</w:t>
-      </w:r>
-      <w:proofErr w:type="spellEnd"/>
-      <w:r>
-        <w:rPr>
-          <w:rFonts w:ascii="Arial" w:hAnsi="Arial" w:cs="Arial"/>
-        </w:rPr>
-        <w:t xml:space="preserve"> herramientas para solucionar diversos problemas de la materia y a priori.</w:t>
+        <w:t>El mayor logro en general es todo el aprendizaje que estamos adquiriendo mediante estos proyectos, para así tener mas herramientas para solucionar diversos problemas de la materia y a priori.</w:t>
       </w:r>
     </w:p>
     <w:p>
@@ -738,21 +556,7 @@
         <w:rPr>
           <w:rFonts w:ascii="Arial" w:hAnsi="Arial" w:cs="Arial"/>
         </w:rPr>
-        <w:t xml:space="preserve"> logramos dividir de forma efectiva como íbamos a llevar a cabo el proyecto, sin embargo, nos comprometemos a ser </w:t>
-      </w:r>
-      <w:proofErr w:type="spellStart"/>
-      <w:r>
-        <w:rPr>
-          <w:rFonts w:ascii="Arial" w:hAnsi="Arial" w:cs="Arial"/>
-        </w:rPr>
-        <w:t>mas</w:t>
-      </w:r>
-      <w:proofErr w:type="spellEnd"/>
-      <w:r>
-        <w:rPr>
-          <w:rFonts w:ascii="Arial" w:hAnsi="Arial" w:cs="Arial"/>
-        </w:rPr>
-        <w:t xml:space="preserve"> rigurosos con esta organización para mejorar la calidad de los siguientes entregables.</w:t>
+        <w:t xml:space="preserve"> logramos dividir de forma efectiva como íbamos a llevar a cabo el proyecto, sin embargo, nos comprometemos a ser mas rigurosos con esta organización para mejorar la calidad de los siguientes entregables.</w:t>
       </w:r>
     </w:p>
     <w:p>
@@ -797,125 +601,13 @@
         <w:rPr>
           <w:rFonts w:ascii="Arial" w:hAnsi="Arial" w:cs="Arial"/>
         </w:rPr>
-        <w:t xml:space="preserve">La práctica XP más útil es “The </w:t>
-      </w:r>
-      <w:proofErr w:type="spellStart"/>
-      <w:r>
-        <w:rPr>
-          <w:rFonts w:ascii="Arial" w:hAnsi="Arial" w:cs="Arial"/>
-        </w:rPr>
-        <w:t>project</w:t>
-      </w:r>
-      <w:proofErr w:type="spellEnd"/>
-      <w:r>
-        <w:rPr>
-          <w:rFonts w:ascii="Arial" w:hAnsi="Arial" w:cs="Arial"/>
-        </w:rPr>
-        <w:t xml:space="preserve"> </w:t>
-      </w:r>
-      <w:proofErr w:type="spellStart"/>
-      <w:r>
-        <w:rPr>
-          <w:rFonts w:ascii="Arial" w:hAnsi="Arial" w:cs="Arial"/>
-        </w:rPr>
-        <w:t>is</w:t>
-      </w:r>
-      <w:proofErr w:type="spellEnd"/>
-      <w:r>
-        <w:rPr>
-          <w:rFonts w:ascii="Arial" w:hAnsi="Arial" w:cs="Arial"/>
-        </w:rPr>
-        <w:t xml:space="preserve"> </w:t>
-      </w:r>
-      <w:proofErr w:type="spellStart"/>
-      <w:r>
-        <w:rPr>
-          <w:rFonts w:ascii="Arial" w:hAnsi="Arial" w:cs="Arial"/>
-        </w:rPr>
-        <w:t>divided</w:t>
-      </w:r>
-      <w:proofErr w:type="spellEnd"/>
-      <w:r>
-        <w:rPr>
-          <w:rFonts w:ascii="Arial" w:hAnsi="Arial" w:cs="Arial"/>
-        </w:rPr>
-        <w:t xml:space="preserve"> </w:t>
-      </w:r>
-      <w:proofErr w:type="spellStart"/>
-      <w:r>
-        <w:rPr>
-          <w:rFonts w:ascii="Arial" w:hAnsi="Arial" w:cs="Arial"/>
-        </w:rPr>
-        <w:t>into</w:t>
-      </w:r>
-      <w:proofErr w:type="spellEnd"/>
-      <w:r>
-        <w:rPr>
-          <w:rFonts w:ascii="Arial" w:hAnsi="Arial" w:cs="Arial"/>
-        </w:rPr>
-        <w:t xml:space="preserve"> </w:t>
-      </w:r>
-      <w:proofErr w:type="spellStart"/>
-      <w:r>
-        <w:rPr>
-          <w:rFonts w:ascii="Arial" w:hAnsi="Arial" w:cs="Arial"/>
-        </w:rPr>
-        <w:t>iterations</w:t>
-      </w:r>
-      <w:proofErr w:type="spellEnd"/>
-      <w:r>
-        <w:rPr>
-          <w:rFonts w:ascii="Arial" w:hAnsi="Arial" w:cs="Arial"/>
-        </w:rPr>
-        <w:t xml:space="preserve">”, debido a </w:t>
-      </w:r>
-      <w:proofErr w:type="gramStart"/>
-      <w:r>
-        <w:rPr>
-          <w:rFonts w:ascii="Arial" w:hAnsi="Arial" w:cs="Arial"/>
-        </w:rPr>
-        <w:t>que</w:t>
-      </w:r>
-      <w:proofErr w:type="gramEnd"/>
-      <w:r>
-        <w:rPr>
-          <w:rFonts w:ascii="Arial" w:hAnsi="Arial" w:cs="Arial"/>
-        </w:rPr>
-        <w:t xml:space="preserve"> dividiendo el problema e</w:t>
-      </w:r>
-      <w:r>
-        <w:rPr>
-          <w:rFonts w:ascii="Arial" w:hAnsi="Arial" w:cs="Arial"/>
-        </w:rPr>
-        <w:t xml:space="preserve">n iteraciones, por </w:t>
-      </w:r>
-      <w:proofErr w:type="gramStart"/>
-      <w:r>
-        <w:rPr>
-          <w:rFonts w:ascii="Arial" w:hAnsi="Arial" w:cs="Arial"/>
-        </w:rPr>
-        <w:t>ejemplo</w:t>
-      </w:r>
-      <w:proofErr w:type="gramEnd"/>
-      <w:r>
-        <w:rPr>
-          <w:rFonts w:ascii="Arial" w:hAnsi="Arial" w:cs="Arial"/>
-        </w:rPr>
-        <w:t xml:space="preserve"> los </w:t>
-      </w:r>
-      <w:proofErr w:type="spellStart"/>
-      <w:r>
-        <w:rPr>
-          <w:rFonts w:ascii="Arial" w:hAnsi="Arial" w:cs="Arial"/>
-        </w:rPr>
-        <w:t>mini-ciclos</w:t>
-      </w:r>
-      <w:proofErr w:type="spellEnd"/>
-      <w:r>
-        <w:rPr>
-          <w:rFonts w:ascii="Arial" w:hAnsi="Arial" w:cs="Arial"/>
-        </w:rPr>
-        <w:t>, se es más fácil llegar al objetivo de manera eficaz</w:t>
+        <w:t>La práctica XP más útil es “The project is divided into iterations”, debido a que dividiendo el problema e</w:t>
+      </w:r>
+      <w:r>
+        <w:rPr>
+          <w:rFonts w:ascii="Arial" w:hAnsi="Arial" w:cs="Arial"/>
+        </w:rPr>
+        <w:t>n iteraciones, por ejemplo los mini-ciclos, se es más fácil llegar al objetivo de manera eficaz</w:t>
       </w:r>
     </w:p>
     <w:p>
@@ -960,35 +652,7 @@
         <w:rPr>
           <w:rFonts w:ascii="Arial" w:hAnsi="Arial" w:cs="Arial"/>
         </w:rPr>
-        <w:t xml:space="preserve">Consideramos que la documentación de Oracle para el uso de </w:t>
-      </w:r>
-      <w:proofErr w:type="spellStart"/>
-      <w:r>
-        <w:rPr>
-          <w:rFonts w:ascii="Arial" w:hAnsi="Arial" w:cs="Arial"/>
-        </w:rPr>
-        <w:t>TreeMap</w:t>
-      </w:r>
-      <w:proofErr w:type="spellEnd"/>
-      <w:r>
-        <w:rPr>
-          <w:rFonts w:ascii="Arial" w:hAnsi="Arial" w:cs="Arial"/>
-        </w:rPr>
-        <w:t xml:space="preserve"> fue lo más útil debido a que gracias </w:t>
-      </w:r>
-      <w:proofErr w:type="spellStart"/>
-      <w:r>
-        <w:rPr>
-          <w:rFonts w:ascii="Arial" w:hAnsi="Arial" w:cs="Arial"/>
-        </w:rPr>
-        <w:t>a el</w:t>
-      </w:r>
-      <w:proofErr w:type="spellEnd"/>
-      <w:r>
-        <w:rPr>
-          <w:rFonts w:ascii="Arial" w:hAnsi="Arial" w:cs="Arial"/>
-        </w:rPr>
-        <w:t xml:space="preserve"> pudimos guardar los objetos que necesitábamos usando esta estructura de datos.</w:t>
+        <w:t>Consideramos que la documentación de Oracle para el uso de TreeMap fue lo más útil debido a que gracias a el pudimos guardar los objetos que necesitábamos usando esta estructura de datos.</w:t>
       </w:r>
     </w:p>
     <w:p>
@@ -1033,23 +697,7 @@
           <w:rFonts w:ascii="Arial" w:hAnsi="Arial" w:cs="Arial"/>
           <w:lang w:val="en-GB"/>
         </w:rPr>
-        <w:t xml:space="preserve"> (2nd ed.). </w:t>
-      </w:r>
-      <w:proofErr w:type="spellStart"/>
-      <w:r>
-        <w:rPr>
-          <w:rFonts w:ascii="Arial" w:hAnsi="Arial" w:cs="Arial"/>
-          <w:lang w:val="en-GB"/>
-        </w:rPr>
-        <w:t>Apress</w:t>
-      </w:r>
-      <w:proofErr w:type="spellEnd"/>
-      <w:r>
-        <w:rPr>
-          <w:rFonts w:ascii="Arial" w:hAnsi="Arial" w:cs="Arial"/>
-          <w:lang w:val="en-GB"/>
-        </w:rPr>
-        <w:t xml:space="preserve">. </w:t>
+        <w:t xml:space="preserve"> (2nd ed.). Apress. </w:t>
       </w:r>
       <w:hyperlink r:id="rId7" w:tgtFrame="_blank" w:history="1">
         <w:r>
@@ -1063,14 +711,18 @@
       </w:hyperlink>
     </w:p>
     <w:p>
-      <w:r>
-        <w:rPr>
-          <w:rFonts w:ascii="Arial" w:hAnsi="Arial" w:cs="Arial"/>
+      <w:pPr>
+        <w:rPr>
           <w:lang w:val="en-US"/>
         </w:rPr>
+      </w:pPr>
+      <w:r>
+        <w:rPr>
+          <w:rFonts w:ascii="Arial" w:hAnsi="Arial" w:cs="Arial"/>
+          <w:lang w:val="en-US"/>
+        </w:rPr>
         <w:t xml:space="preserve">Oracle. (s. f.). </w:t>
       </w:r>
-      <w:proofErr w:type="spellStart"/>
       <w:r>
         <w:rPr>
           <w:rFonts w:ascii="Arial" w:hAnsi="Arial" w:cs="Arial"/>
@@ -1078,17 +730,7 @@
           <w:iCs/>
           <w:lang w:val="en-US"/>
         </w:rPr>
-        <w:t>TreeMap</w:t>
-      </w:r>
-      <w:proofErr w:type="spellEnd"/>
-      <w:r>
-        <w:rPr>
-          <w:rFonts w:ascii="Arial" w:hAnsi="Arial" w:cs="Arial"/>
-          <w:i/>
-          <w:iCs/>
-          <w:lang w:val="en-US"/>
-        </w:rPr>
-        <w:t xml:space="preserve"> (Java Platform SE 17)</w:t>
+        <w:t>TreeMap (Java Platform SE 17)</w:t>
       </w:r>
       <w:r>
         <w:rPr>
@@ -1108,7 +750,13 @@
         </w:r>
       </w:hyperlink>
     </w:p>
-    <w:p/>
+    <w:p>
+      <w:pPr>
+        <w:rPr>
+          <w:lang w:val="en-US"/>
+        </w:rPr>
+      </w:pPr>
+    </w:p>
     <w:p>
       <w:pPr>
         <w:jc w:val="center"/>
@@ -1132,7 +780,6 @@
           <w:lang w:val="en-US"/>
         </w:rPr>
       </w:pPr>
-      <w:proofErr w:type="spellStart"/>
       <w:r>
         <w:rPr>
           <w:rFonts w:ascii="Arial" w:hAnsi="Arial" w:cs="Arial"/>
@@ -1140,7 +787,6 @@
         </w:rPr>
         <w:t>Retrospectiva</w:t>
       </w:r>
-      <w:proofErr w:type="spellEnd"/>
     </w:p>
     <w:p>
       <w:pPr>
@@ -1157,22 +803,270 @@
         <w:rPr>
           <w:rFonts w:ascii="Arial" w:hAnsi="Arial" w:cs="Arial"/>
         </w:rPr>
-        <w:t xml:space="preserve">¿Cuáles fueron los </w:t>
-      </w:r>
-      <w:proofErr w:type="spellStart"/>
-      <w:r>
-        <w:rPr>
-          <w:rFonts w:ascii="Arial" w:hAnsi="Arial" w:cs="Arial"/>
-        </w:rPr>
-        <w:t>mini-ciclos</w:t>
-      </w:r>
-      <w:proofErr w:type="spellEnd"/>
-      <w:r>
-        <w:rPr>
-          <w:rFonts w:ascii="Arial" w:hAnsi="Arial" w:cs="Arial"/>
-        </w:rPr>
-        <w:t xml:space="preserve"> definidos? Justifíquenlos.</w:t>
-      </w:r>
+        <w:t>¿Cuáles fueron los mini-ciclos definidos? Justifíquenlos.</w:t>
+      </w:r>
+    </w:p>
+    <w:p>
+      <w:pPr>
+        <w:rPr>
+          <w:rFonts w:ascii="Arial" w:hAnsi="Arial" w:cs="Arial"/>
+        </w:rPr>
+      </w:pPr>
+      <w:r>
+        <w:rPr>
+          <w:rFonts w:ascii="Arial" w:hAnsi="Arial" w:cs="Arial"/>
+        </w:rPr>
+        <w:t>Establecimos 6 mini-ciclos:</w:t>
+      </w:r>
+    </w:p>
+    <w:p>
+      <w:pPr>
+        <w:pStyle w:val="Prrafodelista"/>
+        <w:numPr>
+          <w:ilvl w:val="0"/>
+          <w:numId w:val="9"/>
+        </w:numPr>
+        <w:rPr>
+          <w:rFonts w:ascii="Arial" w:hAnsi="Arial" w:cs="Arial"/>
+        </w:rPr>
+      </w:pPr>
+      <w:r>
+        <w:rPr>
+          <w:rFonts w:ascii="Arial" w:hAnsi="Arial" w:cs="Arial"/>
+        </w:rPr>
+        <w:t xml:space="preserve">Fijar y soltar una rueda: </w:t>
+      </w:r>
+      <w:r>
+        <w:rPr>
+          <w:rFonts w:ascii="Arial" w:hAnsi="Arial" w:cs="Arial"/>
+        </w:rPr>
+        <w:t>Darles</w:t>
+      </w:r>
+      <w:r>
+        <w:rPr>
+          <w:rFonts w:ascii="Arial" w:hAnsi="Arial" w:cs="Arial"/>
+        </w:rPr>
+        <w:t xml:space="preserve"> esta nueva condición a las ruedas e implementarlas en los demás métodos en los que sea necesario</w:t>
+      </w:r>
+    </w:p>
+    <w:p>
+      <w:pPr>
+        <w:pStyle w:val="Prrafodelista"/>
+        <w:numPr>
+          <w:ilvl w:val="0"/>
+          <w:numId w:val="9"/>
+        </w:numPr>
+        <w:rPr>
+          <w:rFonts w:ascii="Arial" w:hAnsi="Arial" w:cs="Arial"/>
+        </w:rPr>
+      </w:pPr>
+      <w:r>
+        <w:rPr>
+          <w:rFonts w:ascii="Arial" w:hAnsi="Arial" w:cs="Arial"/>
+        </w:rPr>
+        <w:t>Intercambiar 2 ruedas: Permitir que dos ruedas diferentes cambien sus colores respectivos</w:t>
+      </w:r>
+    </w:p>
+    <w:p>
+      <w:pPr>
+        <w:pStyle w:val="Prrafodelista"/>
+        <w:numPr>
+          <w:ilvl w:val="0"/>
+          <w:numId w:val="9"/>
+        </w:numPr>
+        <w:rPr>
+          <w:rFonts w:ascii="Arial" w:hAnsi="Arial" w:cs="Arial"/>
+        </w:rPr>
+      </w:pPr>
+      <w:r>
+        <w:rPr>
+          <w:rFonts w:ascii="Arial" w:hAnsi="Arial" w:cs="Arial"/>
+        </w:rPr>
+        <w:t>Rotar una rueda un numero dado de pasos:</w:t>
+      </w:r>
+      <w:r>
+        <w:rPr>
+          <w:rFonts w:ascii="Arial" w:hAnsi="Arial" w:cs="Arial"/>
+        </w:rPr>
+        <w:t xml:space="preserve"> Permitir que una rueda sea capaz de realizar spin un numero deseado de ruedas, verificando los diferentes casos que resulten en estos spins como, por ejemplo, un jackpot</w:t>
+      </w:r>
+    </w:p>
+    <w:p>
+      <w:pPr>
+        <w:pStyle w:val="Prrafodelista"/>
+        <w:numPr>
+          <w:ilvl w:val="0"/>
+          <w:numId w:val="9"/>
+        </w:numPr>
+        <w:rPr>
+          <w:rFonts w:ascii="Arial" w:hAnsi="Arial" w:cs="Arial"/>
+        </w:rPr>
+      </w:pPr>
+      <w:r>
+        <w:rPr>
+          <w:rFonts w:ascii="Arial" w:hAnsi="Arial" w:cs="Arial"/>
+        </w:rPr>
+        <w:t>Dejar la maquina en una configuración dada: Permitir que el usuario defina los colores actuales de las ruedas creadas dado un orden determinado.</w:t>
+      </w:r>
+    </w:p>
+    <w:p>
+      <w:pPr>
+        <w:pStyle w:val="Prrafodelista"/>
+        <w:numPr>
+          <w:ilvl w:val="0"/>
+          <w:numId w:val="9"/>
+        </w:numPr>
+        <w:rPr>
+          <w:rFonts w:ascii="Arial" w:hAnsi="Arial" w:cs="Arial"/>
+        </w:rPr>
+      </w:pPr>
+      <w:r>
+        <w:rPr>
+          <w:rFonts w:ascii="Arial" w:hAnsi="Arial" w:cs="Arial"/>
+        </w:rPr>
+        <w:t>Definir pruebas unitarias para cada método nuevo</w:t>
+      </w:r>
+    </w:p>
+    <w:p>
+      <w:pPr>
+        <w:pStyle w:val="Prrafodelista"/>
+        <w:numPr>
+          <w:ilvl w:val="0"/>
+          <w:numId w:val="9"/>
+        </w:numPr>
+        <w:rPr>
+          <w:rFonts w:ascii="Arial" w:hAnsi="Arial" w:cs="Arial"/>
+        </w:rPr>
+      </w:pPr>
+      <w:r>
+        <w:rPr>
+          <w:rFonts w:ascii="Arial" w:hAnsi="Arial" w:cs="Arial"/>
+        </w:rPr>
+        <w:t>Crear las 2 pruebas de aceptación mediante una nueva clase.</w:t>
+      </w:r>
+    </w:p>
+    <w:p>
+      <w:pPr>
+        <w:ind w:left="360"/>
+        <w:rPr>
+          <w:rFonts w:ascii="Arial" w:hAnsi="Arial" w:cs="Arial"/>
+        </w:rPr>
+      </w:pPr>
+      <w:r>
+        <w:rPr>
+          <w:rFonts w:ascii="Arial" w:hAnsi="Arial" w:cs="Arial"/>
+          <w:noProof/>
+        </w:rPr>
+        <w:drawing>
+          <wp:inline distT="0" distB="0" distL="0" distR="0" wp14:anchorId="38D40986" wp14:editId="737BE4DE">
+            <wp:extent cx="2773680" cy="3975028"/>
+            <wp:effectExtent l="0" t="0" r="7620" b="6985"/>
+            <wp:docPr id="1119122279" name="Imagen 1"/>
+            <wp:cNvGraphicFramePr>
+              <a:graphicFrameLocks xmlns:a="http://schemas.openxmlformats.org/drawingml/2006/main" noChangeAspect="1"/>
+            </wp:cNvGraphicFramePr>
+            <a:graphic xmlns:a="http://schemas.openxmlformats.org/drawingml/2006/main">
+              <a:graphicData uri="http://schemas.openxmlformats.org/drawingml/2006/picture">
+                <pic:pic xmlns:pic="http://schemas.openxmlformats.org/drawingml/2006/picture">
+                  <pic:nvPicPr>
+                    <pic:cNvPr id="1119122279" name="Imagen 1119122279"/>
+                    <pic:cNvPicPr/>
+                  </pic:nvPicPr>
+                  <pic:blipFill>
+                    <a:blip r:embed="rId9" cstate="print">
+                      <a:extLst>
+                        <a:ext uri="{28A0092B-C50C-407E-A947-70E740481C1C}">
+                          <a14:useLocalDpi xmlns:a14="http://schemas.microsoft.com/office/drawing/2010/main" val="0"/>
+                        </a:ext>
+                      </a:extLst>
+                    </a:blip>
+                    <a:stretch>
+                      <a:fillRect/>
+                    </a:stretch>
+                  </pic:blipFill>
+                  <pic:spPr>
+                    <a:xfrm>
+                      <a:off x="0" y="0"/>
+                      <a:ext cx="2807742" cy="4023843"/>
+                    </a:xfrm>
+                    <a:prstGeom prst="rect">
+                      <a:avLst/>
+                    </a:prstGeom>
+                  </pic:spPr>
+                </pic:pic>
+              </a:graphicData>
+            </a:graphic>
+          </wp:inline>
+        </w:drawing>
+      </w:r>
+      <w:r>
+        <w:rPr>
+          <w:rFonts w:ascii="Arial" w:hAnsi="Arial" w:cs="Arial"/>
+          <w:noProof/>
+        </w:rPr>
+        <w:t xml:space="preserve">                          </w:t>
+      </w:r>
+      <w:r>
+        <w:rPr>
+          <w:rFonts w:ascii="Arial" w:hAnsi="Arial" w:cs="Arial"/>
+          <w:noProof/>
+        </w:rPr>
+        <w:drawing>
+          <wp:inline distT="0" distB="0" distL="0" distR="0" wp14:anchorId="232A4762" wp14:editId="051E38F6">
+            <wp:extent cx="2697407" cy="3988365"/>
+            <wp:effectExtent l="0" t="0" r="8255" b="0"/>
+            <wp:docPr id="2016033896" name="Imagen 2"/>
+            <wp:cNvGraphicFramePr>
+              <a:graphicFrameLocks xmlns:a="http://schemas.openxmlformats.org/drawingml/2006/main" noChangeAspect="1"/>
+            </wp:cNvGraphicFramePr>
+            <a:graphic xmlns:a="http://schemas.openxmlformats.org/drawingml/2006/main">
+              <a:graphicData uri="http://schemas.openxmlformats.org/drawingml/2006/picture">
+                <pic:pic xmlns:pic="http://schemas.openxmlformats.org/drawingml/2006/picture">
+                  <pic:nvPicPr>
+                    <pic:cNvPr id="2016033896" name="Imagen 2016033896"/>
+                    <pic:cNvPicPr/>
+                  </pic:nvPicPr>
+                  <pic:blipFill>
+                    <a:blip r:embed="rId10" cstate="print">
+                      <a:extLst>
+                        <a:ext uri="{28A0092B-C50C-407E-A947-70E740481C1C}">
+                          <a14:useLocalDpi xmlns:a14="http://schemas.microsoft.com/office/drawing/2010/main" val="0"/>
+                        </a:ext>
+                      </a:extLst>
+                    </a:blip>
+                    <a:stretch>
+                      <a:fillRect/>
+                    </a:stretch>
+                  </pic:blipFill>
+                  <pic:spPr>
+                    <a:xfrm>
+                      <a:off x="0" y="0"/>
+                      <a:ext cx="2719029" cy="4020334"/>
+                    </a:xfrm>
+                    <a:prstGeom prst="rect">
+                      <a:avLst/>
+                    </a:prstGeom>
+                  </pic:spPr>
+                </pic:pic>
+              </a:graphicData>
+            </a:graphic>
+          </wp:inline>
+        </w:drawing>
+      </w:r>
+      <w:r>
+        <w:rPr>
+          <w:rFonts w:ascii="Arial" w:hAnsi="Arial" w:cs="Arial"/>
+        </w:rPr>
+        <w:t xml:space="preserve"> </w:t>
+      </w:r>
+    </w:p>
+    <w:p>
+      <w:pPr>
+        <w:ind w:left="360"/>
+        <w:rPr>
+          <w:rFonts w:ascii="Arial" w:hAnsi="Arial" w:cs="Arial"/>
+        </w:rPr>
+      </w:pPr>
     </w:p>
     <w:p>
       <w:pPr>
@@ -1183,19 +1077,315 @@
         </w:numPr>
         <w:rPr>
           <w:rFonts w:ascii="Arial" w:hAnsi="Arial" w:cs="Arial"/>
-        </w:rPr>
-      </w:pPr>
-      <w:r>
-        <w:rPr>
-          <w:rFonts w:ascii="Arial" w:hAnsi="Arial" w:cs="Arial"/>
-        </w:rPr>
-        <w:t xml:space="preserve">¿Cuáles fueron los </w:t>
+          <w:noProof/>
+        </w:rPr>
+      </w:pPr>
+      <w:r>
+        <w:rPr>
+          <w:rFonts w:ascii="Arial" w:hAnsi="Arial" w:cs="Arial"/>
+          <w:noProof/>
+        </w:rPr>
+        <w:t>¿Cuál es el estado actual del proyecto en términos de mini-ciclos? ¿por qué?</w:t>
+      </w:r>
+    </w:p>
+    <w:p>
+      <w:pPr>
+        <w:rPr>
+          <w:rFonts w:ascii="Arial" w:hAnsi="Arial" w:cs="Arial"/>
+        </w:rPr>
+      </w:pPr>
+      <w:r>
+        <w:rPr>
+          <w:rFonts w:ascii="Arial" w:hAnsi="Arial" w:cs="Arial"/>
+        </w:rPr>
+        <w:t>El estado actual, en términos de mini-ciclos, se encuentra totalmente terminado, cumpliendo la organización propuesta en los mini-ciclos.</w:t>
+      </w:r>
+    </w:p>
+    <w:p>
+      <w:pPr>
+        <w:pStyle w:val="Prrafodelista"/>
+        <w:numPr>
+          <w:ilvl w:val="0"/>
+          <w:numId w:val="8"/>
+        </w:numPr>
+        <w:rPr>
+          <w:rFonts w:ascii="Arial" w:hAnsi="Arial" w:cs="Arial"/>
+        </w:rPr>
+      </w:pPr>
+      <w:r>
+        <w:rPr>
+          <w:rFonts w:ascii="Arial" w:hAnsi="Arial" w:cs="Arial"/>
+        </w:rPr>
+        <w:t>¿Cuál fue el tiempo total invertido por cada uno de ustedes? (Horas/Hombre)</w:t>
+      </w:r>
+    </w:p>
+    <w:p>
+      <w:pPr>
+        <w:rPr>
+          <w:rFonts w:ascii="Arial" w:hAnsi="Arial" w:cs="Arial"/>
+        </w:rPr>
+      </w:pPr>
+      <w:r>
+        <w:rPr>
+          <w:rFonts w:ascii="Arial" w:hAnsi="Arial" w:cs="Arial"/>
+        </w:rPr>
+        <w:t>En total se realizo una inversión de</w:t>
+      </w:r>
+      <w:r>
+        <w:rPr>
+          <w:rFonts w:ascii="Arial" w:hAnsi="Arial" w:cs="Arial"/>
+        </w:rPr>
+        <w:t xml:space="preserve"> 8</w:t>
+      </w:r>
+      <w:r>
+        <w:rPr>
+          <w:rFonts w:ascii="Arial" w:hAnsi="Arial" w:cs="Arial"/>
+        </w:rPr>
+        <w:t xml:space="preserve"> horas por persona.</w:t>
+      </w:r>
+    </w:p>
+    <w:p>
+      <w:pPr>
+        <w:pStyle w:val="Prrafodelista"/>
+        <w:numPr>
+          <w:ilvl w:val="0"/>
+          <w:numId w:val="8"/>
+        </w:numPr>
+        <w:rPr>
+          <w:rFonts w:ascii="Arial" w:hAnsi="Arial" w:cs="Arial"/>
+        </w:rPr>
+      </w:pPr>
+      <w:r>
+        <w:rPr>
+          <w:rFonts w:ascii="Arial" w:hAnsi="Arial" w:cs="Arial"/>
+        </w:rPr>
+        <w:t>¿Cuál consideran fue el mayor logro? ¿Por qué?</w:t>
+      </w:r>
+    </w:p>
+    <w:p>
+      <w:pPr>
+        <w:rPr>
+          <w:rFonts w:ascii="Arial" w:hAnsi="Arial" w:cs="Arial"/>
+        </w:rPr>
+      </w:pPr>
+      <w:r>
+        <w:rPr>
+          <w:rFonts w:ascii="Arial" w:hAnsi="Arial" w:cs="Arial"/>
+        </w:rPr>
+        <w:t xml:space="preserve">El mayor logro que conseguimos fue configurar el código de manera efectiva para que pueda </w:t>
+      </w:r>
+      <w:r>
+        <w:rPr>
+          <w:rFonts w:ascii="Arial" w:hAnsi="Arial" w:cs="Arial"/>
+        </w:rPr>
+        <w:t>ser extensible para poder modificarlo a futuro.</w:t>
+      </w:r>
+    </w:p>
+    <w:p>
+      <w:pPr>
+        <w:pStyle w:val="Prrafodelista"/>
+        <w:numPr>
+          <w:ilvl w:val="0"/>
+          <w:numId w:val="8"/>
+        </w:numPr>
+        <w:rPr>
+          <w:rFonts w:ascii="Arial" w:hAnsi="Arial" w:cs="Arial"/>
+        </w:rPr>
+      </w:pPr>
+      <w:r>
+        <w:rPr>
+          <w:rFonts w:ascii="Arial" w:hAnsi="Arial" w:cs="Arial"/>
+        </w:rPr>
+        <w:t>¿Cuál consideran que fue el mayor problema técnico? ¿Qué hicieron para resolverlo?</w:t>
+      </w:r>
+    </w:p>
+    <w:p>
+      <w:pPr>
+        <w:rPr>
+          <w:rFonts w:ascii="Arial" w:hAnsi="Arial" w:cs="Arial"/>
+        </w:rPr>
+      </w:pPr>
+      <w:r>
+        <w:rPr>
+          <w:rFonts w:ascii="Arial" w:hAnsi="Arial" w:cs="Arial"/>
+        </w:rPr>
+        <w:t>El mayor problema técnico fue modificar y/o arreglar el código anterior para solucionar los problemas de extensibilidad, lo solucionamos replanteándonos la estructura de este mismo para volverlo escalable.</w:t>
+      </w:r>
+    </w:p>
+    <w:p>
+      <w:pPr>
+        <w:pStyle w:val="Prrafodelista"/>
+        <w:numPr>
+          <w:ilvl w:val="0"/>
+          <w:numId w:val="8"/>
+        </w:numPr>
+        <w:rPr>
+          <w:rFonts w:ascii="Arial" w:hAnsi="Arial" w:cs="Arial"/>
+        </w:rPr>
+      </w:pPr>
+      <w:r>
+        <w:rPr>
+          <w:rFonts w:ascii="Arial" w:hAnsi="Arial" w:cs="Arial"/>
+        </w:rPr>
+        <w:t>¿Qué hicieron bien como equipo? ¿Qué se comprometen a hacer para mejorar los resultados?</w:t>
+      </w:r>
+    </w:p>
+    <w:p>
+      <w:pPr>
+        <w:rPr>
+          <w:rFonts w:ascii="Arial" w:hAnsi="Arial" w:cs="Arial"/>
+        </w:rPr>
+      </w:pPr>
+      <w:r>
+        <w:rPr>
+          <w:rFonts w:ascii="Arial" w:hAnsi="Arial" w:cs="Arial"/>
+        </w:rPr>
+        <w:t xml:space="preserve">Como equipo, logramos dividir de forma efectiva como íbamos a llevar a cabo el proyecto, sin embargo, nos comprometemos a ser </w:t>
       </w:r>
       <w:proofErr w:type="spellStart"/>
       <w:r>
         <w:rPr>
           <w:rFonts w:ascii="Arial" w:hAnsi="Arial" w:cs="Arial"/>
         </w:rPr>
+        <w:t>mas</w:t>
+      </w:r>
+      <w:proofErr w:type="spellEnd"/>
+      <w:r>
+        <w:rPr>
+          <w:rFonts w:ascii="Arial" w:hAnsi="Arial" w:cs="Arial"/>
+        </w:rPr>
+        <w:t xml:space="preserve"> rigurosos con esta organización para mejorar la calidad de los siguientes entregables.</w:t>
+      </w:r>
+    </w:p>
+    <w:p>
+      <w:pPr>
+        <w:pStyle w:val="Prrafodelista"/>
+        <w:numPr>
+          <w:ilvl w:val="0"/>
+          <w:numId w:val="8"/>
+        </w:numPr>
+        <w:rPr>
+          <w:rFonts w:ascii="Arial" w:hAnsi="Arial" w:cs="Arial"/>
+        </w:rPr>
+      </w:pPr>
+      <w:r>
+        <w:rPr>
+          <w:rFonts w:ascii="Arial" w:hAnsi="Arial" w:cs="Arial"/>
+        </w:rPr>
+        <w:t>Considerando las prácticas XP incluidas en los laboratorios. ¿cuál fue la más útil? ¿por qué?</w:t>
+      </w:r>
+    </w:p>
+    <w:p>
+      <w:pPr>
+        <w:rPr>
+          <w:rFonts w:ascii="Arial" w:hAnsi="Arial" w:cs="Arial"/>
+        </w:rPr>
+      </w:pPr>
+      <w:r>
+        <w:rPr>
+          <w:rFonts w:ascii="Arial" w:hAnsi="Arial" w:cs="Arial"/>
+        </w:rPr>
+        <w:t xml:space="preserve">La práctica XP más útil es “The </w:t>
+      </w:r>
+      <w:proofErr w:type="spellStart"/>
+      <w:r>
+        <w:rPr>
+          <w:rFonts w:ascii="Arial" w:hAnsi="Arial" w:cs="Arial"/>
+        </w:rPr>
+        <w:t>project</w:t>
+      </w:r>
+      <w:proofErr w:type="spellEnd"/>
+      <w:r>
+        <w:rPr>
+          <w:rFonts w:ascii="Arial" w:hAnsi="Arial" w:cs="Arial"/>
+        </w:rPr>
+        <w:t xml:space="preserve"> </w:t>
+      </w:r>
+      <w:proofErr w:type="spellStart"/>
+      <w:r>
+        <w:rPr>
+          <w:rFonts w:ascii="Arial" w:hAnsi="Arial" w:cs="Arial"/>
+        </w:rPr>
+        <w:t>is</w:t>
+      </w:r>
+      <w:proofErr w:type="spellEnd"/>
+      <w:r>
+        <w:rPr>
+          <w:rFonts w:ascii="Arial" w:hAnsi="Arial" w:cs="Arial"/>
+        </w:rPr>
+        <w:t xml:space="preserve"> </w:t>
+      </w:r>
+      <w:proofErr w:type="spellStart"/>
+      <w:r>
+        <w:rPr>
+          <w:rFonts w:ascii="Arial" w:hAnsi="Arial" w:cs="Arial"/>
+        </w:rPr>
+        <w:t>divided</w:t>
+      </w:r>
+      <w:proofErr w:type="spellEnd"/>
+      <w:r>
+        <w:rPr>
+          <w:rFonts w:ascii="Arial" w:hAnsi="Arial" w:cs="Arial"/>
+        </w:rPr>
+        <w:t xml:space="preserve"> </w:t>
+      </w:r>
+      <w:proofErr w:type="spellStart"/>
+      <w:r>
+        <w:rPr>
+          <w:rFonts w:ascii="Arial" w:hAnsi="Arial" w:cs="Arial"/>
+        </w:rPr>
+        <w:t>into</w:t>
+      </w:r>
+      <w:proofErr w:type="spellEnd"/>
+      <w:r>
+        <w:rPr>
+          <w:rFonts w:ascii="Arial" w:hAnsi="Arial" w:cs="Arial"/>
+        </w:rPr>
+        <w:t xml:space="preserve"> </w:t>
+      </w:r>
+      <w:proofErr w:type="spellStart"/>
+      <w:r>
+        <w:rPr>
+          <w:rFonts w:ascii="Arial" w:hAnsi="Arial" w:cs="Arial"/>
+        </w:rPr>
+        <w:t>iterations</w:t>
+      </w:r>
+      <w:proofErr w:type="spellEnd"/>
+      <w:r>
+        <w:rPr>
+          <w:rFonts w:ascii="Arial" w:hAnsi="Arial" w:cs="Arial"/>
+        </w:rPr>
+        <w:t xml:space="preserve">”, debido a </w:t>
+      </w:r>
+      <w:r>
+        <w:rPr>
+          <w:rFonts w:ascii="Arial" w:hAnsi="Arial" w:cs="Arial"/>
+        </w:rPr>
+        <w:t>que,</w:t>
+      </w:r>
+      <w:r>
+        <w:rPr>
+          <w:rFonts w:ascii="Arial" w:hAnsi="Arial" w:cs="Arial"/>
+        </w:rPr>
+        <w:t xml:space="preserve"> dividiendo el problema en iteraciones, por </w:t>
+      </w:r>
+      <w:r>
+        <w:rPr>
+          <w:rFonts w:ascii="Arial" w:hAnsi="Arial" w:cs="Arial"/>
+        </w:rPr>
+        <w:t>ejemplo,</w:t>
+      </w:r>
+      <w:r>
+        <w:rPr>
+          <w:rFonts w:ascii="Arial" w:hAnsi="Arial" w:cs="Arial"/>
+        </w:rPr>
+        <w:t xml:space="preserve"> los </w:t>
+      </w:r>
+      <w:proofErr w:type="spellStart"/>
+      <w:r>
+        <w:rPr>
+          <w:rFonts w:ascii="Arial" w:hAnsi="Arial" w:cs="Arial"/>
+        </w:rPr>
         <w:t>mini-ciclos</w:t>
       </w:r>
       <w:proofErr w:type="spellEnd"/>
@@ -1203,8 +1393,102 @@
         <w:rPr>
           <w:rFonts w:ascii="Arial" w:hAnsi="Arial" w:cs="Arial"/>
         </w:rPr>
-        <w:t xml:space="preserve"> definidos? Justifíquenlos.</w:t>
-      </w:r>
+        <w:t>, se es más fácil llegar al objetivo de manera eficaz</w:t>
+      </w:r>
+    </w:p>
+    <w:p>
+      <w:pPr>
+        <w:pStyle w:val="Prrafodelista"/>
+        <w:numPr>
+          <w:ilvl w:val="0"/>
+          <w:numId w:val="8"/>
+        </w:numPr>
+        <w:rPr>
+          <w:rFonts w:ascii="Arial" w:hAnsi="Arial" w:cs="Arial"/>
+        </w:rPr>
+      </w:pPr>
+      <w:r>
+        <w:rPr>
+          <w:rFonts w:ascii="Arial" w:hAnsi="Arial" w:cs="Arial"/>
+        </w:rPr>
+        <w:t>¿Qué referencias usaron? ¿Cuál fue la más útil? Incluyan citas con estándares adecuados.</w:t>
+      </w:r>
+    </w:p>
+    <w:p>
+      <w:pPr>
+        <w:rPr>
+          <w:rFonts w:ascii="Arial" w:hAnsi="Arial" w:cs="Arial"/>
+        </w:rPr>
+      </w:pPr>
+      <w:r>
+        <w:rPr>
+          <w:rFonts w:ascii="Arial" w:hAnsi="Arial" w:cs="Arial"/>
+        </w:rPr>
+        <w:t xml:space="preserve">Consideramos que </w:t>
+      </w:r>
+      <w:r>
+        <w:rPr>
+          <w:rFonts w:ascii="Arial" w:hAnsi="Arial" w:cs="Arial"/>
+        </w:rPr>
+        <w:t xml:space="preserve">w3schools java fue la herramienta mas útil, ya que con este pudimos conocer métodos propios de java para poder acortar cantidades significantes el código, como por ejemplo el </w:t>
+      </w:r>
+      <w:proofErr w:type="spellStart"/>
+      <w:r>
+        <w:rPr>
+          <w:rFonts w:ascii="Arial" w:hAnsi="Arial" w:cs="Arial"/>
+        </w:rPr>
+        <w:t>toArray</w:t>
+      </w:r>
+      <w:proofErr w:type="spellEnd"/>
+      <w:r>
+        <w:rPr>
+          <w:rFonts w:ascii="Arial" w:hAnsi="Arial" w:cs="Arial"/>
+        </w:rPr>
+        <w:t>().</w:t>
+      </w:r>
+    </w:p>
+    <w:p>
+      <w:pPr>
+        <w:rPr>
+          <w:rFonts w:ascii="Arial" w:hAnsi="Arial" w:cs="Arial"/>
+          <w:lang w:val="en-US"/>
+        </w:rPr>
+      </w:pPr>
+      <w:r>
+        <w:rPr>
+          <w:rFonts w:ascii="Arial" w:hAnsi="Arial" w:cs="Arial"/>
+        </w:rPr>
+        <w:tab/>
+      </w:r>
+      <w:r>
+        <w:rPr>
+          <w:rFonts w:ascii="Arial" w:hAnsi="Arial" w:cs="Arial"/>
+        </w:rPr>
+        <w:t xml:space="preserve">Java Tutorial </w:t>
+      </w:r>
+      <w:r>
+        <w:rPr>
+          <w:rFonts w:ascii="Arial" w:hAnsi="Arial" w:cs="Arial"/>
+          <w:lang w:val="en-US"/>
+        </w:rPr>
+        <w:t>https://www.w3schools.com/java/</w:t>
+      </w:r>
+    </w:p>
+    <w:p>
+      <w:pPr>
+        <w:rPr>
+          <w:rFonts w:ascii="Arial" w:hAnsi="Arial" w:cs="Arial"/>
+          <w:lang w:val="en-US"/>
+        </w:rPr>
+      </w:pPr>
+    </w:p>
+    <w:p>
+      <w:pPr>
+        <w:rPr>
+          <w:rFonts w:ascii="Arial" w:hAnsi="Arial" w:cs="Arial"/>
+          <w:lang w:val="en-US"/>
+        </w:rPr>
+      </w:pPr>
     </w:p>
     <w:p>
       <w:pPr>
@@ -1227,6 +1511,119 @@
 <file path=word/numbering.xml><?xml version="1.0" encoding="utf-8"?>
 <w:numbering xmlns:wpc="http://schemas.microsoft.com/office/word/2010/wordprocessingCanvas" xmlns:cx="http://schemas.microsoft.com/office/drawing/2014/chartex" xmlns:cx1="http://schemas.microsoft.com/office/drawing/2015/9/8/chartex" xmlns:cx2="http://schemas.microsoft.com/office/drawing/2015/10/21/chartex" xmlns:cx3="http://schemas.microsoft.com/office/drawing/2016/5/9/chartex" xmlns:cx4="http://schemas.microsoft.com/office/drawing/2016/5/10/chartex" xmlns:cx5="http://schemas.microsoft.com/office/drawing/2016/5/11/chartex" xmlns:cx6="http://schemas.microsoft.com/office/drawing/2016/5/12/chartex" xmlns:cx7="http://schemas.microsoft.com/office/drawing/2016/5/13/chartex" xmlns:cx8="http://schemas.microsoft.com/office/drawing/2016/5/14/chartex" xmlns:mc="http://schemas.openxmlformats.org/markup-compatibility/2006" xmlns:aink="http://schemas.microsoft.com/office/drawing/2016/ink" xmlns:am3d="http://schemas.microsoft.com/office/drawing/2017/model3d" xmlns:o="urn:schemas-microsoft-com:office:office" xmlns:oel="http://schemas.microsoft.com/office/2019/extlst" xmlns:r="http://schemas.openxmlformats.org/officeDocument/2006/relationships" xmlns:m="http://schemas.openxmlformats.org/officeDocument/2006/math" xmlns:v="urn:schemas-microsoft-com:vml" xmlns:wp14="http://schemas.microsoft.com/office/word/2010/wordprocessingDrawing" xmlns:wp="http://schemas.openxmlformats.org/drawingml/2006/wordprocessingDrawing" xmlns:w10="urn:schemas-microsoft-com:office:word" xmlns:w="http://schemas.openxmlformats.org/wordprocessingml/2006/main" xmlns:w14="http://schemas.microsoft.com/office/word/2010/wordml" xmlns:w15="http://schemas.microsoft.com/office/word/2012/wordml" xmlns:w16cex="http://schemas.microsoft.com/office/word/2018/wordml/cex" xmlns:w16cid="http://schemas.microsoft.com/office/word/2016/wordml/cid" xmlns:w16="http://schemas.microsoft.com/office/word/2018/wordml" xmlns:w16du="http://schemas.microsoft.com/office/word/2023/wordml/word16du" xmlns:w16sdtdh="http://schemas.microsoft.com/office/word/2020/wordml/sdtdatahash" xmlns:w16sdtfl="http://schemas.microsoft.com/office/word/2024/wordml/sdtformatlock" xmlns:w16se="http://schemas.microsoft.com/office/word/2015/wordml/symex" xmlns:wpg="http://schemas.microsoft.com/office/word/2010/wordprocessingGroup" xmlns:wpi="http://schemas.microsoft.com/office/word/2010/wordprocessingInk" xmlns:wne="http://schemas.microsoft.com/office/word/2006/wordml" xmlns:wps="http://schemas.microsoft.com/office/word/2010/wordprocessingShape" mc:Ignorable="w14 w15 w16se w16cid w16 w16cex w16sdtdh w16sdtfl w16du wp14">
   <w:abstractNum w:abstractNumId="0" w15:restartNumberingAfterBreak="0">
+    <w:nsid w:val="09C739E0"/>
+    <w:multiLevelType w:val="hybridMultilevel"/>
+    <w:tmpl w:val="16FAC7CC"/>
+    <w:lvl w:ilvl="0" w:tplc="04090001">
+      <w:start w:val="1"/>
+      <w:numFmt w:val="bullet"/>
+      <w:lvlText w:val=""/>
+      <w:lvlJc w:val="left"/>
+      <w:pPr>
+        <w:ind w:left="720" w:hanging="360"/>
+      </w:pPr>
+      <w:rPr>
+        <w:rFonts w:ascii="Symbol" w:hAnsi="Symbol" w:hint="default"/>
+      </w:rPr>
+    </w:lvl>
+    <w:lvl w:ilvl="1" w:tplc="04090003" w:tentative="1">
+      <w:start w:val="1"/>
+      <w:numFmt w:val="bullet"/>
+      <w:lvlText w:val="o"/>
+      <w:lvlJc w:val="left"/>
+      <w:pPr>
+        <w:ind w:left="1440" w:hanging="360"/>
+      </w:pPr>
+      <w:rPr>
+        <w:rFonts w:ascii="Courier New" w:hAnsi="Courier New" w:cs="Courier New" w:hint="default"/>
+      </w:rPr>
+    </w:lvl>
+    <w:lvl w:ilvl="2" w:tplc="04090005" w:tentative="1">
+      <w:start w:val="1"/>
+      <w:numFmt w:val="bullet"/>
+      <w:lvlText w:val=""/>
+      <w:lvlJc w:val="left"/>
+      <w:pPr>
+        <w:ind w:left="2160" w:hanging="360"/>
+      </w:pPr>
+      <w:rPr>
+        <w:rFonts w:ascii="Wingdings" w:hAnsi="Wingdings" w:hint="default"/>
+      </w:rPr>
+    </w:lvl>
+    <w:lvl w:ilvl="3" w:tplc="04090001" w:tentative="1">
+      <w:start w:val="1"/>
+      <w:numFmt w:val="bullet"/>
+      <w:lvlText w:val=""/>
+      <w:lvlJc w:val="left"/>
+      <w:pPr>
+        <w:ind w:left="2880" w:hanging="360"/>
+      </w:pPr>
+      <w:rPr>
+        <w:rFonts w:ascii="Symbol" w:hAnsi="Symbol" w:hint="default"/>
+      </w:rPr>
+    </w:lvl>
+    <w:lvl w:ilvl="4" w:tplc="04090003" w:tentative="1">
+      <w:start w:val="1"/>
+      <w:numFmt w:val="bullet"/>
+      <w:lvlText w:val="o"/>
+      <w:lvlJc w:val="left"/>
+      <w:pPr>
+        <w:ind w:left="3600" w:hanging="360"/>
+      </w:pPr>
+      <w:rPr>
+        <w:rFonts w:ascii="Courier New" w:hAnsi="Courier New" w:cs="Courier New" w:hint="default"/>
+      </w:rPr>
+    </w:lvl>
+    <w:lvl w:ilvl="5" w:tplc="04090005" w:tentative="1">
+      <w:start w:val="1"/>
+      <w:numFmt w:val="bullet"/>
+      <w:lvlText w:val=""/>
+      <w:lvlJc w:val="left"/>
+      <w:pPr>
+        <w:ind w:left="4320" w:hanging="360"/>
+      </w:pPr>
+      <w:rPr>
+        <w:rFonts w:ascii="Wingdings" w:hAnsi="Wingdings" w:hint="default"/>
+      </w:rPr>
+    </w:lvl>
+    <w:lvl w:ilvl="6" w:tplc="04090001" w:tentative="1">
+      <w:start w:val="1"/>
+      <w:numFmt w:val="bullet"/>
+      <w:lvlText w:val=""/>
+      <w:lvlJc w:val="left"/>
+      <w:pPr>
+        <w:ind w:left="5040" w:hanging="360"/>
+      </w:pPr>
+      <w:rPr>
+        <w:rFonts w:ascii="Symbol" w:hAnsi="Symbol" w:hint="default"/>
+      </w:rPr>
+    </w:lvl>
+    <w:lvl w:ilvl="7" w:tplc="04090003" w:tentative="1">
+      <w:start w:val="1"/>
+      <w:numFmt w:val="bullet"/>
+      <w:lvlText w:val="o"/>
+      <w:lvlJc w:val="left"/>
+      <w:pPr>
+        <w:ind w:left="5760" w:hanging="360"/>
+      </w:pPr>
+      <w:rPr>
+        <w:rFonts w:ascii="Courier New" w:hAnsi="Courier New" w:cs="Courier New" w:hint="default"/>
+      </w:rPr>
+    </w:lvl>
+    <w:lvl w:ilvl="8" w:tplc="04090005" w:tentative="1">
+      <w:start w:val="1"/>
+      <w:numFmt w:val="bullet"/>
+      <w:lvlText w:val=""/>
+      <w:lvlJc w:val="left"/>
+      <w:pPr>
+        <w:ind w:left="6480" w:hanging="360"/>
+      </w:pPr>
+      <w:rPr>
+        <w:rFonts w:ascii="Wingdings" w:hAnsi="Wingdings" w:hint="default"/>
+      </w:rPr>
+    </w:lvl>
+  </w:abstractNum>
+  <w:abstractNum w:abstractNumId="1" w15:restartNumberingAfterBreak="0">
     <w:nsid w:val="1EAF61F6"/>
     <w:multiLevelType w:val="hybridMultilevel"/>
     <w:tmpl w:val="BD50439E"/>
@@ -1339,7 +1736,7 @@
       </w:rPr>
     </w:lvl>
   </w:abstractNum>
-  <w:abstractNum w:abstractNumId="1" w15:restartNumberingAfterBreak="0">
+  <w:abstractNum w:abstractNumId="2" w15:restartNumberingAfterBreak="0">
     <w:nsid w:val="2F034159"/>
     <w:multiLevelType w:val="hybridMultilevel"/>
     <w:tmpl w:val="A7DC258E"/>
@@ -1355,7 +1752,7 @@
         <w:rFonts w:hint="default"/>
       </w:rPr>
     </w:lvl>
-    <w:lvl w:ilvl="1" w:tplc="FFFFFFFF" w:tentative="1">
+    <w:lvl w:ilvl="1" w:tplc="FFFFFFFF">
       <w:start w:val="1"/>
       <w:numFmt w:val="lowerLetter"/>
       <w:lvlText w:val="%2."/>
@@ -1364,7 +1761,7 @@
         <w:ind w:left="1440" w:hanging="360"/>
       </w:pPr>
     </w:lvl>
-    <w:lvl w:ilvl="2" w:tplc="FFFFFFFF" w:tentative="1">
+    <w:lvl w:ilvl="2" w:tplc="FFFFFFFF">
       <w:start w:val="1"/>
       <w:numFmt w:val="lowerRoman"/>
       <w:lvlText w:val="%3."/>
@@ -1428,7 +1825,7 @@
       </w:pPr>
     </w:lvl>
   </w:abstractNum>
-  <w:abstractNum w:abstractNumId="2" w15:restartNumberingAfterBreak="0">
+  <w:abstractNum w:abstractNumId="3" w15:restartNumberingAfterBreak="0">
     <w:nsid w:val="2F813169"/>
     <w:multiLevelType w:val="hybridMultilevel"/>
     <w:tmpl w:val="B654511C"/>
@@ -1540,7 +1937,7 @@
       </w:rPr>
     </w:lvl>
   </w:abstractNum>
-  <w:abstractNum w:abstractNumId="3" w15:restartNumberingAfterBreak="0">
+  <w:abstractNum w:abstractNumId="4" w15:restartNumberingAfterBreak="0">
     <w:nsid w:val="4632292D"/>
     <w:multiLevelType w:val="hybridMultilevel"/>
     <w:tmpl w:val="91FE54A0"/>
@@ -1629,7 +2026,7 @@
       </w:pPr>
     </w:lvl>
   </w:abstractNum>
-  <w:abstractNum w:abstractNumId="4" w15:restartNumberingAfterBreak="0">
+  <w:abstractNum w:abstractNumId="5" w15:restartNumberingAfterBreak="0">
     <w:nsid w:val="46851B6C"/>
     <w:multiLevelType w:val="hybridMultilevel"/>
     <w:tmpl w:val="C85C167A"/>
@@ -1742,7 +2139,7 @@
       </w:rPr>
     </w:lvl>
   </w:abstractNum>
-  <w:abstractNum w:abstractNumId="5" w15:restartNumberingAfterBreak="0">
+  <w:abstractNum w:abstractNumId="6" w15:restartNumberingAfterBreak="0">
     <w:nsid w:val="5942735D"/>
     <w:multiLevelType w:val="hybridMultilevel"/>
     <w:tmpl w:val="A7DC258E"/>
@@ -1831,7 +2228,7 @@
       </w:pPr>
     </w:lvl>
   </w:abstractNum>
-  <w:abstractNum w:abstractNumId="6" w15:restartNumberingAfterBreak="0">
+  <w:abstractNum w:abstractNumId="7" w15:restartNumberingAfterBreak="0">
     <w:nsid w:val="6A742939"/>
     <w:multiLevelType w:val="hybridMultilevel"/>
     <w:tmpl w:val="64E6497A"/>
@@ -1943,7 +2340,7 @@
       </w:rPr>
     </w:lvl>
   </w:abstractNum>
-  <w:abstractNum w:abstractNumId="7" w15:restartNumberingAfterBreak="0">
+  <w:abstractNum w:abstractNumId="8" w15:restartNumberingAfterBreak="0">
     <w:nsid w:val="70122276"/>
     <w:multiLevelType w:val="hybridMultilevel"/>
     <w:tmpl w:val="F85A1F5C"/>
@@ -2056,28 +2453,31 @@
     </w:lvl>
   </w:abstractNum>
   <w:num w:numId="1" w16cid:durableId="773749116">
+    <w:abstractNumId w:val="6"/>
+  </w:num>
+  <w:num w:numId="2" w16cid:durableId="1747337313">
+    <w:abstractNumId w:val="1"/>
+  </w:num>
+  <w:num w:numId="3" w16cid:durableId="562374706">
     <w:abstractNumId w:val="5"/>
   </w:num>
-  <w:num w:numId="2" w16cid:durableId="1747337313">
-    <w:abstractNumId w:val="0"/>
+  <w:num w:numId="4" w16cid:durableId="767308716">
+    <w:abstractNumId w:val="8"/>
   </w:num>
-  <w:num w:numId="3" w16cid:durableId="562374706">
+  <w:num w:numId="5" w16cid:durableId="1103919818">
+    <w:abstractNumId w:val="3"/>
+  </w:num>
+  <w:num w:numId="6" w16cid:durableId="1765802500">
+    <w:abstractNumId w:val="7"/>
+  </w:num>
+  <w:num w:numId="7" w16cid:durableId="538320218">
     <w:abstractNumId w:val="4"/>
   </w:num>
-  <w:num w:numId="4" w16cid:durableId="767308716">
-    <w:abstractNumId w:val="7"/>
-  </w:num>
-  <w:num w:numId="5" w16cid:durableId="1103919818">
+  <w:num w:numId="8" w16cid:durableId="660163994">
     <w:abstractNumId w:val="2"/>
   </w:num>
-  <w:num w:numId="6" w16cid:durableId="1765802500">
-    <w:abstractNumId w:val="6"/>
-  </w:num>
-  <w:num w:numId="7" w16cid:durableId="538320218">
-    <w:abstractNumId w:val="3"/>
-  </w:num>
-  <w:num w:numId="8" w16cid:durableId="660163994">
-    <w:abstractNumId w:val="1"/>
+  <w:num w:numId="9" w16cid:durableId="2139955251">
+    <w:abstractNumId w:val="0"/>
   </w:num>
 </w:numbering>
 </file>

</xml_diff>